<commit_message>
presentation: drop the inaccurate "findings without a quote are discarded" claim
The pitch materials said every finding must carry a verbatim quote or
it gets discarded. The code does not do that: _coerce_findings keeps a
finding when it has an issue OR a quote, and _anchor_empty_section_findings
goes the other way - it restores a heading as evidence for quote-less
empty-section findings. A judge reading the source would catch it.

Replaced with what is actually true: the prompt asks for a verbatim
quote, and in our runs all twenty findings came back with one.

Also shortened the "while the analysis runs" narration - it repeated
the architecture slide almost line for line.

Co-Authored-By: Claude Opus 5 <noreply@anthropic.com>
</commit_message>
<xml_diff>
--- a/presentation/Речь — по слайдам и демо.docx
+++ b/presentation/Речь — по слайдам и демо.docx
@@ -356,7 +356,7 @@
           <w:sz w:val="24"/>
           <w:szCs w:val="24"/>
         </w:rPr>
-        <w:t xml:space="preserve">Внутри три слоя. Разбор документа. Проверка по официальным критериям — двадцать один раздел шаблона и восемь требований кейсодателя. И LLM-ревью по двадцати трём доменным категориям. Первые два слоя — обычный код: детерминированы и воспроизводимы. Модель отвечает только за смысл, и у неё жёсткое правило — каждое замечание обязано содержать дословную цитату, иначе оно отбрасывается. Поэтому без доступа к модели инструмент продолжает работать.</w:t>
+        <w:t xml:space="preserve">Внутри три слоя. Разбор документа. Проверка по официальным критериям — двадцать один раздел шаблона и восемь требований кейсодателя. И LLM-ревью по двадцати трём доменным категориям. Первые два слоя — обычный код: детерминированы и воспроизводимы. Модель отвечает только за смысл, и промпт требует к каждому замечанию дословную цитату из документа — в наших прогонах её содержали все двадцать. Поэтому без доступа к модели инструмент продолжает работать.</w:t>
       </w:r>
     </w:p>
     <w:p>
@@ -546,7 +546,7 @@
           <w:sz w:val="21"/>
           <w:szCs w:val="21"/>
         </w:rPr>
-        <w:t xml:space="preserve">ПОКА ИДЁТ АНАЛИЗ — говорить не спеша, этого хватает примерно на минуту</w:t>
+        <w:t xml:space="preserve">ПОКА ИДЁТ АНАЛИЗ — говорить не спеша, хватает секунд на тридцать-сорок</w:t>
       </w:r>
     </w:p>
     <w:p>
@@ -563,7 +563,7 @@
           <w:sz w:val="23"/>
           <w:szCs w:val="23"/>
         </w:rPr>
-        <w:t xml:space="preserve">Пока идёт анализ, коротко расскажу, что происходит внутри.</w:t>
+        <w:t xml:space="preserve">Пока идёт анализ — коротко о том, что происходит. Документ разбирается на разделы вместе с таблицами из Word: в техзадании на данные структура полей лежит именно в таблицах.</w:t>
       </w:r>
     </w:p>
     <w:p>
@@ -580,7 +580,7 @@
           <w:sz w:val="23"/>
           <w:szCs w:val="23"/>
         </w:rPr>
-        <w:t xml:space="preserve">Сначала документ разбирается на разделы: заголовки, нумерация, таблицы. Таблицы из Word мы сохраняем специально — в техзадании на данные именно в них лежит структура полей.</w:t>
+        <w:t xml:space="preserve">Дальше структура сверяется с официальным шаблоном МТС и с восемью требованиями, которые прислал кейсодатель: сериализация, Data Catalog, обязательность полей, кластер Kafka, путь в HDFS, справочники. Это обычный код, без модели.</w:t>
       </w:r>
     </w:p>
     <w:p>
@@ -597,58 +597,7 @@
           <w:sz w:val="23"/>
           <w:szCs w:val="23"/>
         </w:rPr>
-        <w:t xml:space="preserve">Дальше идёт детерминированная проверка, без модели. Структура сверяется с двадцатью одним разделом официального шаблона МТС. И отдельно проверяются восемь требований, которые кейсодатель прислал отдельным файлом: спецификация сериализации, ссылка на Data Catalog, обязательность полей, кластер Kafka, полный путь в HDFS и перечень справочников.</w:t>
-      </w:r>
-    </w:p>
-    <w:p>
-      <w:pPr>
-        <w:pStyle w:val="ListParagraph"/>
-        <w:numPr>
-          <w:ilvl w:val="0"/>
-          <w:numId w:val="1"/>
-        </w:numPr>
-        <w:spacing w:after="130" w:line="320"/>
-      </w:pPr>
-      <w:r>
-        <w:rPr>
-          <w:sz w:val="23"/>
-          <w:szCs w:val="23"/>
-        </w:rPr>
-        <w:t xml:space="preserve">И только третьим шагом текст уходит в модель. У неё рубрика из двадцати трёх доменных категорий: источники, ключи и гранулярность, историчность, инкрементальная загрузка, дедупликация, качество данных и так далее.</w:t>
-      </w:r>
-    </w:p>
-    <w:p>
-      <w:pPr>
-        <w:pStyle w:val="ListParagraph"/>
-        <w:numPr>
-          <w:ilvl w:val="0"/>
-          <w:numId w:val="1"/>
-        </w:numPr>
-        <w:spacing w:after="130" w:line="320"/>
-      </w:pPr>
-      <w:r>
-        <w:rPr>
-          <w:sz w:val="23"/>
-          <w:szCs w:val="23"/>
-        </w:rPr>
-        <w:t xml:space="preserve">Важное правило: каждое замечание модели обязано содержать дословную цитату из документа. Если цитаты нет — замечание отбрасывается. Это защита и от общих советов, и от выдуманных проблем.</w:t>
-      </w:r>
-    </w:p>
-    <w:p>
-      <w:pPr>
-        <w:pStyle w:val="ListParagraph"/>
-        <w:numPr>
-          <w:ilvl w:val="0"/>
-          <w:numId w:val="1"/>
-        </w:numPr>
-        <w:spacing w:after="130" w:line="320"/>
-      </w:pPr>
-      <w:r>
-        <w:rPr>
-          <w:sz w:val="23"/>
-          <w:szCs w:val="23"/>
-        </w:rPr>
-        <w:t xml:space="preserve">Параллельно работают простые правила без модели: пустые разделы, поля без типа, аббревиатуры без расшифровки. Поэтому если доступа к модели нет, инструмент всё равно даёт результат — просто менее глубокий.</w:t>
+        <w:t xml:space="preserve">И только потом текст уходит в модель — она отвечает за смысл: противоречия, неоднозначные формулировки, пропущенные детали. К каждому замечанию промпт требует дословную цитату из документа.</w:t>
       </w:r>
     </w:p>
     <w:p>

</xml_diff>